<commit_message>
exp+docs: conformal prediction (4.8), Laya zero-shot (4.9), theory 2.9; updates to ch1/ch5/abstract
</commit_message>
<xml_diff>
--- a/docs/thesis-abstract.docx
+++ b/docs/thesis-abstract.docx
@@ -55,7 +55,7 @@
           <w:b w:val="0"/>
           <w:sz w:val="24"/>
         </w:rPr>
-        <w:t>研究发现：（1）公开数据的评估集中有 54% 的文本原样出现在训练集中，这种数据泄漏使 TF-IDF 基线的宏平均 F1 虚高 8.1 个百分点，并把其与 RoBERTa 的真实差距缩小约三分之二；本文据此重新构建了无泄漏的数据划分。（2）LoRA 微调的大模型宏平均 F1 为 0.798～0.807，高于 RoBERTa 的 0.778 和 TF-IDF 的 0.70，零样本和少样本提示则明显不及有监督微调。（3）以多随机种子方差分析衡量训练随机性时，大模型的优势显著；以 McNemar 检验和配对 Bootstrap 衡量测试样本抽样误差时，约 2 个百分点的优势仅边缘显著或不显著，说明该优势稳定但幅度较小。（4）零样本大模型平均置信度达 96.4%，而准确率仅 67.1%；LoRA 微调与温度缩放可将期望校准误差降至 0.013～0.030，只处理置信度最高的 50% 样本时准确率约为 96%。（5）重复标注样本的一致率为 82.9%（κ = 0.735），据此估计准确率上限约为 91%，且 82% 的标注冲突涉及中性类，解释了中性类识别困难的原因。此外，4 比特 QLoRA 在峰值显存 11.2 GB 下取得了与 16 位 LoRA 相当的效果。</w:t>
+        <w:t>研究发现：（1）公开数据的评估集中有 54% 的文本原样出现在训练集中，这种数据泄漏使 TF-IDF 基线的宏平均 F1 虚高 8.1 个百分点，并把其与 RoBERTa 的真实差距缩小约三分之二；本文据此重新构建了无泄漏的数据划分。（2）LoRA 微调的大模型宏平均 F1 为 0.798～0.807，高于 RoBERTa 的 0.778 和 TF-IDF 的 0.70，零样本和少样本提示则明显不及有监督微调。（3）以多随机种子方差分析衡量训练随机性时，大模型的优势显著；以 McNemar 检验和配对 Bootstrap 衡量测试样本抽样误差时，约 2 个百分点的优势仅边缘显著或不显著，说明该优势稳定但幅度较小。（4）零样本大模型平均置信度达 96.4%，而准确率仅 67.1%；LoRA 微调与温度缩放可将期望校准误差降至 0.013～0.030，只处理置信度最高的 50% 样本时准确率约为 96%；保形预测可在保证 90% 覆盖率的同时，对约 78% 的评论给出唯一类别。（5）重复标注样本的一致率为 82.9%（κ = 0.735），据此估计准确率上限约为 91%，且 82% 的标注冲突涉及中性类，解释了中性类识别困难的原因。此外，4 比特 QLoRA 在峰值显存 11.2 GB 下取得了与 16 位 LoRA 相当的效果。</w:t>
       </w:r>
     </w:p>
     <w:p>
@@ -147,7 +147,7 @@
           <w:b w:val="0"/>
           <w:sz w:val="24"/>
         </w:rPr>
-        <w:t>The main findings are as follows. (1) In the public data, 54% of the evaluation texts also appear verbatim in the training set. This leakage inflates the macro-F1 of the TF-IDF baseline by 8.1 percentage points and hides about two-thirds of its true gap to RoBERTa; a leakage-free split is therefore constructed. (2) LoRA-tuned LLMs reach a macro-F1 of 0.798–0.807, higher than RoBERTa (0.778) and TF-IDF (0.70), while zero-shot and few-shot prompting fall clearly behind supervised fine-tuning. (3) When training randomness is measured by multi-seed ANOVA, the LLMs' advantage is significant; when test-sample variability is measured by McNemar tests and paired bootstrap, the advantage of about 2 points is only marginally significant or not significant, indicating a stable but small improvement. (4) Zero-shot LLMs are severely overconfident, with a mean confidence of 96.4% against an accuracy of 67.1%. LoRA fine-tuning plus temperature scaling reduces the expected calibration error to 0.013–0.030, and accuracy reaches about 96% when only the 50% most confident samples are answered. (5) Repeatedly annotated texts show an agreement rate of 82.9% (κ = 0.735), implying an accuracy ceiling of about 91%; 82% of annotation conflicts involve the neutral class, which explains why this class is hardest to recognise. In addition, 4-bit QLoRA matches 16-bit LoRA with a peak memory of only 11.2 GB.</w:t>
+        <w:t>The main findings are as follows. (1) In the public data, 54% of the evaluation texts also appear verbatim in the training set. This leakage inflates the macro-F1 of the TF-IDF baseline by 8.1 percentage points and hides about two-thirds of its true gap to RoBERTa; a leakage-free split is therefore constructed. (2) LoRA-tuned LLMs reach a macro-F1 of 0.798–0.807, higher than RoBERTa (0.778) and TF-IDF (0.70), while zero-shot and few-shot prompting fall clearly behind supervised fine-tuning. (3) When training randomness is measured by multi-seed ANOVA, the LLMs' advantage is significant; when test-sample variability is measured by McNemar tests and paired bootstrap, the advantage of about 2 points is only marginally significant or not significant, indicating a stable but small improvement. (4) Zero-shot LLMs are severely overconfident, with a mean confidence of 96.4% against an accuracy of 67.1%. LoRA fine-tuning plus temperature scaling reduces the expected calibration error to 0.013–0.030, accuracy reaches about 96% when only the 50% most confident samples are answered, and conformal prediction guarantees 90% coverage while returning a single label for about 78% of comments. (5) Repeatedly annotated texts show an agreement rate of 82.9% (κ = 0.735), implying an accuracy ceiling of about 91%; 82% of annotation conflicts involve the neutral class, which explains why this class is hardest to recognise. In addition, 4-bit QLoRA matches 16-bit LoRA with a peak memory of only 11.2 GB.</w:t>
       </w:r>
     </w:p>
     <w:p>

</xml_diff>

<commit_message>
chore: migrate repository and sync latest thesis revisions
</commit_message>
<xml_diff>
--- a/docs/thesis-abstract.docx
+++ b/docs/thesis-abstract.docx
@@ -55,7 +55,7 @@
           <w:b w:val="0"/>
           <w:sz w:val="24"/>
         </w:rPr>
-        <w:t>研究发现：（1）公开数据的评估集中有 54% 的文本原样出现在训练集中，这种数据泄漏使 TF-IDF 基线的宏平均 F1 虚高 8.1 个百分点，并把其与 RoBERTa 的真实差距缩小约三分之二；本文据此重新构建了无泄漏的数据划分。（2）LoRA 微调的大模型宏平均 F1 为 0.798～0.807，高于 RoBERTa 的 0.778 和 TF-IDF 的 0.70，零样本和少样本提示则明显不及有监督微调。（3）以多随机种子方差分析衡量训练随机性时，大模型的优势显著；以 McNemar 检验和配对 Bootstrap 衡量测试样本抽样误差时，约 2 个百分点的优势仅边缘显著或不显著，说明该优势稳定但幅度较小。（4）零样本大模型平均置信度达 96.4%，而准确率仅 67.1%；LoRA 微调与温度缩放可将期望校准误差降至 0.013～0.030，只处理置信度最高的 50% 样本时准确率约为 96%；保形预测可在保证 90% 覆盖率的同时，对约 78% 的评论给出唯一类别。（5）重复标注样本的一致率为 82.9%（κ = 0.735），据此估计准确率上限约为 91%，且 82% 的标注冲突涉及中性类，解释了中性类识别困难的原因。此外，4 比特 QLoRA 在峰值显存 11.2 GB 下取得了与 16 位 LoRA 相当的效果。</w:t>
+        <w:t>研究发现：（1）原始评估文件中约 54% 的记录与原始训练文件存在规范化文本重叠；本文区分训练与验证曝光，清洗后得到集合间没有完全重复文本的数据划分，并在共同未曝光样本上比较清洗策略。（2）LoRA 微调的大模型宏平均 F1 为 0.798～0.807，高于 RoBERTa 的 0.778 和 TF-IDF 的 0.70；零样本和少样本提示不及有监督微调。（3）在固定数据划分的三个训练种子中，大模型 F1 点估计均更高，多种子方差分析的事后比较显著；但种子 42 的 McNemar 检验和配对 Bootstrap 经多重比较调整后，未检出大模型相对 RoBERTa 的显著优势。（4）Qwen3 零样本平均置信度为 96.4%，准确率为 67.1%；LoRA 模型经测试分布内五折温度交叉拟合后，期望校准误差为 0.013～0.030，只回答高置信度的一半样本时准确率约为 96%。标准保形预测的整体覆盖率约为 90%，约 77%～78% 的集合为单元素，但该子集准确率为 88.7%～89.3%，不具有单独的 90% 正确率保证。（5）重复记录的配对一致率为 82.9%，82% 的冲突涉及中性类；由于缺少独立复标证据，不将噪声模型推算值解释为实测准确率上限。此外，单次 4 比特 QLoRA 实验在框架记录的峰值分配显存 11.2 GB 下取得了与 16 位 LoRA 接近的效果。</w:t>
       </w:r>
     </w:p>
     <w:p>
@@ -147,7 +147,7 @@
           <w:b w:val="0"/>
           <w:sz w:val="24"/>
         </w:rPr>
-        <w:t>The main findings are as follows. (1) In the public data, 54% of the evaluation texts also appear verbatim in the training set. This leakage inflates the macro-F1 of the TF-IDF baseline by 8.1 percentage points and hides about two-thirds of its true gap to RoBERTa; a leakage-free split is therefore constructed. (2) LoRA-tuned LLMs reach a macro-F1 of 0.798–0.807, higher than RoBERTa (0.778) and TF-IDF (0.70), while zero-shot and few-shot prompting fall clearly behind supervised fine-tuning. (3) When training randomness is measured by multi-seed ANOVA, the LLMs' advantage is significant; when test-sample variability is measured by McNemar tests and paired bootstrap, the advantage of about 2 points is only marginally significant or not significant, indicating a stable but small improvement. (4) Zero-shot LLMs are severely overconfident, with a mean confidence of 96.4% against an accuracy of 67.1%. LoRA fine-tuning plus temperature scaling reduces the expected calibration error to 0.013–0.030, accuracy reaches about 96% when only the 50% most confident samples are answered, and conformal prediction guarantees 90% coverage while returning a single label for about 78% of comments. (5) Repeatedly annotated texts show an agreement rate of 82.9% (κ = 0.735), implying an accuracy ceiling of about 91%; 82% of annotation conflicts involve the neutral class, which explains why this class is hardest to recognise. In addition, 4-bit QLoRA matches 16-bit LoRA with a peak memory of only 11.2 GB.</w:t>
+        <w:t>The main findings are as follows. (1) About 54% of the original evaluation records share normalized text with the original training file. Training exposure is distinguished from validation exposure; cleaning removes exact cross-split duplicates, and cleaning strategies are compared on shared unexposed examples. (2) LoRA-tuned LLMs achieve a macro-F1 of 0.798–0.807, compared with 0.778 for RoBERTa and about 0.70 for TF-IDF. Zero-shot and few-shot prompting perform worse than supervised fine-tuning. (3) The LLMs have higher F1 point estimates across the three training seeds on the fixed data split, with significant post-hoc comparisons in the multi-seed analysis. However, for seed 42, McNemar tests and paired bootstrap intervals do not establish a significant advantage over RoBERTa after multiplicity adjustment. (4) Zero-shot Qwen3 has a mean confidence of 96.4% but an accuracy of 67.1%. Five-fold temperature cross-fitting within the test distribution gives LoRA models an expected calibration error of 0.013–0.030; accuracy is about 96% when answering only the most confident half of the examples. Standard conformal prediction achieves about 90% overall set coverage, with 77%–78% singleton sets. Accuracy within the singleton subset is 88.7%–89.3%, not a separately guaranteed 90%. (5) Duplicate-record pairs agree on 82.9% of labels, and 82% of conflicts involve the neutral class. Without evidence of independent reannotation, a noise-model calculation is not interpreted as an empirical accuracy ceiling. In one run, 4-bit QLoRA performs comparably to 16-bit LoRA, with 11.2 GB of peak framework-allocated GPU memory.</w:t>
       </w:r>
     </w:p>
     <w:p>

</xml_diff>